<commit_message>
brief: be precise about what LinkedIn and Indeed already offer candidates, and where the recruiter-sent gap remains
Co-Authored-By: Claude Sonnet 5.5 <noreply@anthropic.com>
</commit_message>
<xml_diff>
--- a/docs/founder/opportunity-brief-recruiters-send-preps.docx
+++ b/docs/founder/opportunity-brief-recruiters-send-preps.docx
@@ -825,14 +825,30 @@
           <w:sz w:val="19"/>
           <w:szCs w:val="19"/>
         </w:rPr>
-        <w:t xml:space="preserve">"Nobody does this."</w:t>
-      </w:r>
-      <w:r>
-        <w:rPr>
-          <w:sz w:val="19"/>
-          <w:szCs w:val="19"/>
-        </w:rPr>
-        <w:t xml:space="preserve"> I have not found anyone who sells recruiter-sent practice as the product, but adjacent practice tools exist (for example Incruiter and Interviewer.AI). Say "I have not found one", not "there is none".</w:t>
+        <w:t xml:space="preserve">What the big platforms do, and do not do.</w:t>
+      </w:r>
+      <w:r>
+        <w:rPr>
+          <w:sz w:val="19"/>
+          <w:szCs w:val="19"/>
+        </w:rPr>
+        <w:t xml:space="preserve"> LinkedIn Premium offers AI interview practice on job postings (for jobs where the member is a strong match), and Indeed has an AI mock-interview tool (Career Scout). Both are candidate-side and self-serve, and LinkedIn's is behind a paid subscription. I have not found any of them putting practice in the </w:t>
+      </w:r>
+      <w:r>
+        <w:rPr>
+          <w:b/>
+          <w:bCs/>
+          <w:sz w:val="19"/>
+          <w:szCs w:val="19"/>
+        </w:rPr>
+        <w:t xml:space="preserve">recruiter's</w:t>
+      </w:r>
+      <w:r>
+        <w:rPr>
+          <w:sz w:val="19"/>
+          <w:szCs w:val="19"/>
+        </w:rPr>
+        <w:t xml:space="preserve"> hands to send, and none is free to the public beside every job. That is the gap. My first-hand evidence: in 25 years of interviewing and hiring, no recruiter has ever sent me practice questions, and Mike Petrie, 30 years in recruitment, has never seen it either.</w:t>
       </w:r>
     </w:p>
     <w:p>

</xml_diff>

<commit_message>
brief: lead with the moment of booking
Co-Authored-By: Claude Sonnet 5.5 <noreply@anthropic.com>
</commit_message>
<xml_diff>
--- a/docs/founder/opportunity-brief-recruiters-send-preps.docx
+++ b/docs/founder/opportunity-brief-recruiters-send-preps.docx
@@ -53,11 +53,21 @@
       </w:pPr>
       <w:r>
         <w:rPr>
+          <w:b/>
+          <w:bCs/>
           <w:color w:val="475569"/>
           <w:sz w:val="19"/>
           <w:szCs w:val="19"/>
         </w:rPr>
-        <w:t xml:space="preserve">Recruitment is built to find and submit the candidate. Nobody is equipped, or paid, to prepare them, yet the interview is the one moment that decides whether the recruiter earns anything.</w:t>
+        <w:t xml:space="preserve">At the moment a recruiter books an interview, the candidate gets a time, a place and "good luck". We put a rehearsal in that same message.</w:t>
+      </w:r>
+      <w:r>
+        <w:rPr>
+          <w:color w:val="475569"/>
+          <w:sz w:val="19"/>
+          <w:szCs w:val="19"/>
+        </w:rPr>
+        <w:t xml:space="preserve"> Recruitment is built to find and submit the candidate. Nobody is equipped, or paid, to prepare them, yet the interview is the one moment that decides whether the recruiter earns anything.</w:t>
       </w:r>
     </w:p>
     <w:p>
@@ -175,14 +185,14 @@
           <w:sz w:val="19"/>
           <w:szCs w:val="19"/>
         </w:rPr>
-        <w:t xml:space="preserve">Interview Prep (push).</w:t>
-      </w:r>
-      <w:r>
-        <w:rPr>
-          <w:sz w:val="19"/>
-          <w:szCs w:val="19"/>
-        </w:rPr>
-        <w:t xml:space="preserve"> The recruiter sends a link with the job spec and CV loaded. The candidate gets up to 3 practice interviews: spoken, scored on five dimensions, with feedback and a path to a pass.</w:t>
+        <w:t xml:space="preserve">Interview Prep (push), at the point of booking.</w:t>
+      </w:r>
+      <w:r>
+        <w:rPr>
+          <w:sz w:val="19"/>
+          <w:szCs w:val="19"/>
+        </w:rPr>
+        <w:t xml:space="preserve"> The recruiter sends a link, with the interview confirmation, with the job spec and CV loaded. The candidate gets up to 3 practice interviews: spoken, scored on five dimensions, with feedback and a path to a pass.</w:t>
       </w:r>
     </w:p>
     <w:p>

</xml_diff>

<commit_message>
brief: the habit (a prep with every interview arranged) and the attach-rate measure
Co-Authored-By: Claude Sonnet 5.5 <noreply@anthropic.com>
</commit_message>
<xml_diff>
--- a/docs/founder/opportunity-brief-recruiters-send-preps.docx
+++ b/docs/founder/opportunity-brief-recruiters-send-preps.docx
@@ -59,6 +59,29 @@
           <w:sz w:val="19"/>
           <w:szCs w:val="19"/>
         </w:rPr>
+        <w:t xml:space="preserve">Send a prep link every time you arrange an interview.</w:t>
+      </w:r>
+      <w:r>
+        <w:rPr>
+          <w:color w:val="475569"/>
+          <w:sz w:val="19"/>
+          <w:szCs w:val="19"/>
+        </w:rPr>
+        <w:t xml:space="preserve"> That is the whole habit. Simple.</w:t>
+      </w:r>
+    </w:p>
+    <w:p>
+      <w:pPr>
+        <w:spacing w:after="103"/>
+      </w:pPr>
+      <w:r>
+        <w:rPr>
+          <w:b/>
+          <w:bCs/>
+          <w:color w:val="475569"/>
+          <w:sz w:val="19"/>
+          <w:szCs w:val="19"/>
+        </w:rPr>
         <w:t xml:space="preserve">At the moment a recruiter books an interview, the candidate gets a time, a place and "good luck". We put a rehearsal in that same message.</w:t>
       </w:r>
       <w:r>
@@ -892,6 +915,39 @@
           <w:szCs w:val="19"/>
         </w:rPr>
         <w:t xml:space="preserve">10 recruiters, 20 preps each, over 30 days.</w:t>
+      </w:r>
+    </w:p>
+    <w:p>
+      <w:pPr>
+        <w:pStyle w:val="ListParagraph"/>
+        <w:numPr>
+          <w:ilvl w:val="0"/>
+          <w:numId w:val="2"/>
+        </w:numPr>
+        <w:spacing w:after="60"/>
+      </w:pPr>
+      <w:r>
+        <w:rPr>
+          <w:sz w:val="19"/>
+          <w:szCs w:val="19"/>
+        </w:rPr>
+        <w:t xml:space="preserve">The headline number is the </w:t>
+      </w:r>
+      <w:r>
+        <w:rPr>
+          <w:b/>
+          <w:bCs/>
+          <w:sz w:val="19"/>
+          <w:szCs w:val="19"/>
+        </w:rPr>
+        <w:t xml:space="preserve">attach rate</w:t>
+      </w:r>
+      <w:r>
+        <w:rPr>
+          <w:sz w:val="19"/>
+          <w:szCs w:val="19"/>
+        </w:rPr>
+        <w:t xml:space="preserve">: of the interviews each recruiter arranges, what share carry a prep link? The aim is every one.</w:t>
       </w:r>
     </w:p>
     <w:p>

</xml_diff>

<commit_message>
brief: 'what we sell is realism' and the two-part pitch (the habit, the product)
Co-Authored-By: Claude Sonnet 5.5 <noreply@anthropic.com>
</commit_message>
<xml_diff>
--- a/docs/founder/opportunity-brief-recruiters-send-preps.docx
+++ b/docs/founder/opportunity-brief-recruiters-send-preps.docx
@@ -68,6 +68,52 @@
           <w:szCs w:val="19"/>
         </w:rPr>
         <w:t xml:space="preserve"> That is the whole habit. Simple.</w:t>
+      </w:r>
+    </w:p>
+    <w:p>
+      <w:pPr>
+        <w:spacing w:after="103"/>
+      </w:pPr>
+      <w:r>
+        <w:rPr>
+          <w:b/>
+          <w:bCs/>
+          <w:color w:val="475569"/>
+          <w:sz w:val="19"/>
+          <w:szCs w:val="19"/>
+        </w:rPr>
+        <w:t xml:space="preserve">What we sell is realism.</w:t>
+      </w:r>
+      <w:r>
+        <w:rPr>
+          <w:color w:val="475569"/>
+          <w:sz w:val="19"/>
+          <w:szCs w:val="19"/>
+        </w:rPr>
+        <w:t xml:space="preserve"> Other tools give you questions. We give you the interview: a live interviewer who looks at you, speaks, listens and reacts, in 32 languages, for the exact job. Nerves only fade when the rehearsal feels real, and that is what we reproduce.</w:t>
+      </w:r>
+    </w:p>
+    <w:p>
+      <w:pPr>
+        <w:spacing w:after="103"/>
+      </w:pPr>
+      <w:r>
+        <w:rPr>
+          <w:b/>
+          <w:bCs/>
+          <w:color w:val="475569"/>
+          <w:sz w:val="19"/>
+          <w:szCs w:val="19"/>
+        </w:rPr>
+        <w:t xml:space="preserve">The pitch in two parts: the habit, and the product.</w:t>
+      </w:r>
+      <w:r>
+        <w:rPr>
+          <w:color w:val="475569"/>
+          <w:sz w:val="19"/>
+          <w:szCs w:val="19"/>
+        </w:rPr>
+        <w:t xml:space="preserve"> The habit: a prep link with every interview arranged. The product: the nearest thing to the real interview.</w:t>
       </w:r>
     </w:p>
     <w:p>

</xml_diff>